<commit_message>
Keep the time axis across derived trajectories; document the Sokal default
Co-Authored-By: Claude Opus 5 <noreply@anthropic.com>
</commit_message>
<xml_diff>
--- a/docs/md-analysis-workflow.docx
+++ b/docs/md-analysis-workflow.docx
@@ -170,7 +170,7 @@
               <w:jc w:val="left"/>
             </w:pPr>
             <w:r>
-              <w:t xml:space="preserve">0.1 (first draft), 2026-09-18</w:t>
+              <w:t xml:space="preserve">0.2, 2026-09-21</w:t>
             </w:r>
           </w:p>
         </w:tc>
@@ -396,7 +396,7 @@
               <a:graphicData uri="http://schemas.openxmlformats.org/drawingml/2006/picture">
                 <pic:pic>
                   <pic:nvPicPr>
-                    <pic:cNvPr descr="/var/folders/7d/bf2y4d097fn5bslhgwh8r5dm0000gn/T/tmp.DXiBELXInP/flow.png" id="22" name="Picture"/>
+                    <pic:cNvPr descr="/var/folders/7d/bf2y4d097fn5bslhgwh8r5dm0000gn/T/tmp.rnslWev98U/flow.png" id="22" name="Picture"/>
                     <pic:cNvPicPr>
                       <a:picLocks noChangeArrowheads="1" noChangeAspect="1"/>
                     </pic:cNvPicPr>
@@ -3273,7 +3273,7 @@
         <w:t xml:space="preserve"> </w:t>
       </w:r>
       <w:r>
-        <w:t xml:space="preserve">fits exp(−t/τ) or (1 − c)e^{−t/τ} + c, up to the first zero crossing, three 1/e times, or all lags. It also returns τ_int integrated up to the first zero crossing.</w:t>
+        <w:t xml:space="preserve">fits exp(−t/τ) or (1 − c)e^{−t/τ} + c, up to the first zero crossing, three 1/e times, or all lags. It also returns τ_int with the chosen estimator (below; Sokal’s window by default, not the fit’s first-zero-crossing truncation).</w:t>
       </w:r>
       <w:r>
         <w:t xml:space="preserve"> </w:t>
@@ -9632,7 +9632,7 @@
               <w:jc w:val="left"/>
             </w:pPr>
             <w:r>
-              <w:t xml:space="preserve">Linear and circular ACF, exp and exp+offset fit, τ_int to first zero, t*, stride, uncorrelated extXYZ; Sokal/Geyer truncation of τ_int with its error; block-averaging plot; g of the subsample; T/τ indicator</w:t>
+              <w:t xml:space="preserve">Linear and circular ACF, exp and exp+offset fit, t*, stride, uncorrelated extXYZ; τ_int (Sokal window default, Geyer or first zero crossing) with its error; block-averaging plot; g of the subsample; T/τ indicator</w:t>
             </w:r>
           </w:p>
         </w:tc>

</xml_diff>